<commit_message>
Keep only tut_stones_logo.png and document Pharaonic theme only
</commit_message>
<xml_diff>
--- a/design_assets/TUT_Stones_Design_Specification.docx
+++ b/design_assets/TUT_Stones_Design_Specification.docx
@@ -25,7 +25,7 @@
           <w:sz w:val="28"/>
           <w:szCs w:val="28"/>
         </w:rPr>
-        <w:t xml:space="preserve">Official Brand &amp; Design Specification Guide</w:t>
+        <w:t xml:space="preserve">Official Brand &amp; Design Specification Guide (Pharaonic Theme)</w:t>
       </w:r>
     </w:p>
     <w:p>
@@ -39,7 +39,7 @@
           <w:sz w:val="20"/>
           <w:szCs w:val="20"/>
         </w:rPr>
-        <w:t xml:space="preserve">Egyptian Marble &amp; Granite Export Web Application | Visual Identity System</w:t>
+        <w:t xml:space="preserve">Egyptian Marble &amp; Granite Export Web Application | Pharaonic Visual Identity</w:t>
       </w:r>
     </w:p>
     <w:p>
@@ -56,7 +56,7 @@
         <w:spacing w:after="200"/>
       </w:pPr>
       <w:r>
-        <w:t xml:space="preserve">TUT Stones combines Egypt's 5,000-year geological heritage with modern luxury architectural design. The visual language is defined by rich stone textures, high-contrast dark modes, elegant Pharaonic color pigments (Terracotta Red, Nile Lapis Blue, Egyptian Gold), and classical typography.</w:t>
+        <w:t xml:space="preserve">TUT Stones combines Egypt's 5,000-year geological heritage with modern luxury architectural design. The visual language is defined by rich stone textures, high-contrast Pharaonic color pigments (Terracotta Red, Nile Lapis Blue, Egyptian Gold), and classical typography.</w:t>
       </w:r>
     </w:p>
     <w:p>
@@ -65,22 +65,15 @@
         <w:spacing w:after="120" w:before="300"/>
       </w:pPr>
       <w:r>
-        <w:t xml:space="preserve">2. Color Palettes &amp; Color Schemes</w:t>
-      </w:r>
-    </w:p>
-    <w:p>
-      <w:pPr>
-        <w:spacing w:after="100" w:before="100"/>
-      </w:pPr>
-      <w:r>
-        <w:rPr>
-          <w:b/>
-          <w:bCs/>
-          <w:color w:val="8D4F4E"/>
-          <w:sz w:val="22"/>
-          <w:szCs w:val="22"/>
-        </w:rPr>
-        <w:t xml:space="preserve">Theme 3: Pharaonic Heritage (Primary Brand Theme)</w:t>
+        <w:t xml:space="preserve">2. Official Color Palette — Pharaonic Heritage Theme</w:t>
+      </w:r>
+    </w:p>
+    <w:p>
+      <w:pPr>
+        <w:spacing w:after="150" w:before="50"/>
+      </w:pPr>
+      <w:r>
+        <w:t xml:space="preserve">Directly derived from ancient Egyptian temple frescoes, lapis lazuli, red ochre, and papyrus sandstone.</w:t>
       </w:r>
     </w:p>
     <w:tbl>
@@ -158,7 +151,7 @@
                 <w:bCs/>
                 <w:color w:val="FFFFFF"/>
               </w:rPr>
-              <w:t xml:space="preserve">Usage</w:t>
+              <w:t xml:space="preserve">Usage &amp; Application</w:t>
             </w:r>
           </w:p>
         </w:tc>
@@ -188,7 +181,7 @@
         <w:tc>
           <w:p>
             <w:r>
-              <w:t xml:space="preserve">Primary CTAs, badges, header borders</w:t>
+              <w:t xml:space="preserve">Section tags, primary CTAs, active buttons, card borders</w:t>
             </w:r>
           </w:p>
         </w:tc>
@@ -218,7 +211,7 @@
         <w:tc>
           <w:p>
             <w:r>
-              <w:t xml:space="preserve">Subheaders, experience badges, icons</w:t>
+              <w:t xml:space="preserve">Subheaders, experience badges, secondary feature icons</w:t>
             </w:r>
           </w:p>
         </w:tc>
@@ -248,16 +241,16 @@
         <w:tc>
           <w:p>
             <w:r>
-              <w:t xml:space="preserve">Header bottom border, active indicators</w:t>
-            </w:r>
-          </w:p>
-        </w:tc>
-      </w:tr>
-      <w:tr>
-        <w:tc>
-          <w:p>
-            <w:r>
-              <w:t xml:space="preserve">Papyrus Light Base</w:t>
+              <w:t xml:space="preserve">Header bottom border, active indicators, highlights</w:t>
+            </w:r>
+          </w:p>
+        </w:tc>
+      </w:tr>
+      <w:tr>
+        <w:tc>
+          <w:p>
+            <w:r>
+              <w:t xml:space="preserve">Papyrus Base</w:t>
             </w:r>
           </w:p>
         </w:tc>
@@ -278,7 +271,7 @@
         <w:tc>
           <w:p>
             <w:r>
-              <w:t xml:space="preserve">Light theme background base</w:t>
+              <w:t xml:space="preserve">Light papyrus background base</w:t>
             </w:r>
           </w:p>
         </w:tc>
@@ -308,7 +301,7 @@
         <w:tc>
           <w:p>
             <w:r>
-              <w:t xml:space="preserve">Body copy text readability</w:t>
+              <w:t xml:space="preserve">Primary readable body text &amp; section titles</w:t>
             </w:r>
           </w:p>
         </w:tc>
@@ -316,280 +309,64 @@
     </w:tbl>
     <w:p>
       <w:pPr>
-        <w:spacing w:after="100" w:before="200"/>
+        <w:pStyle w:val="Heading1"/>
+        <w:spacing w:after="120" w:before="300"/>
+      </w:pPr>
+      <w:r>
+        <w:t xml:space="preserve">3. Typography Hierarchy &amp; Font System</w:t>
+      </w:r>
+    </w:p>
+    <w:p>
+      <w:pPr>
+        <w:spacing w:after="80"/>
       </w:pPr>
       <w:r>
         <w:rPr>
           <w:b/>
           <w:bCs/>
-          <w:color w:val="B89025"/>
-          <w:sz w:val="22"/>
-          <w:szCs w:val="22"/>
-        </w:rPr>
-        <w:t xml:space="preserve">Theme 1: Default Dark Luxury (Noir &amp; Gold)</w:t>
-      </w:r>
-    </w:p>
-    <w:tbl>
-      <w:tblPr>
-        <w:tblW w:type="pct" w:w="100%"/>
-        <w:tblBorders>
-          <w:top w:val="single" w:color="auto" w:sz="4"/>
-          <w:left w:val="single" w:color="auto" w:sz="4"/>
-          <w:bottom w:val="single" w:color="auto" w:sz="4"/>
-          <w:right w:val="single" w:color="auto" w:sz="4"/>
-          <w:insideH w:val="single" w:color="auto" w:sz="4"/>
-          <w:insideV w:val="single" w:color="auto" w:sz="4"/>
-        </w:tblBorders>
-      </w:tblPr>
-      <w:tblGrid>
-        <w:gridCol w:w="100"/>
-        <w:gridCol w:w="100"/>
-        <w:gridCol w:w="100"/>
-        <w:gridCol w:w="100"/>
-      </w:tblGrid>
-      <w:tr>
-        <w:tc>
-          <w:tcPr>
-            <w:shd w:fill="333333" w:val="clear"/>
-          </w:tcPr>
-          <w:p>
-            <w:r>
-              <w:rPr>
-                <w:b/>
-                <w:bCs/>
-                <w:color w:val="FFFFFF"/>
-              </w:rPr>
-              <w:t xml:space="preserve">Token Name</w:t>
-            </w:r>
-          </w:p>
-        </w:tc>
-        <w:tc>
-          <w:tcPr>
-            <w:shd w:fill="333333" w:val="clear"/>
-          </w:tcPr>
-          <w:p>
-            <w:r>
-              <w:rPr>
-                <w:b/>
-                <w:bCs/>
-                <w:color w:val="FFFFFF"/>
-              </w:rPr>
-              <w:t xml:space="preserve">Hex Code</w:t>
-            </w:r>
-          </w:p>
-        </w:tc>
-        <w:tc>
-          <w:tcPr>
-            <w:shd w:fill="333333" w:val="clear"/>
-          </w:tcPr>
-          <w:p>
-            <w:r>
-              <w:rPr>
-                <w:b/>
-                <w:bCs/>
-                <w:color w:val="FFFFFF"/>
-              </w:rPr>
-              <w:t xml:space="preserve">RGB Value</w:t>
-            </w:r>
-          </w:p>
-        </w:tc>
-        <w:tc>
-          <w:tcPr>
-            <w:shd w:fill="333333" w:val="clear"/>
-          </w:tcPr>
-          <w:p>
-            <w:r>
-              <w:rPr>
-                <w:b/>
-                <w:bCs/>
-                <w:color w:val="FFFFFF"/>
-              </w:rPr>
-              <w:t xml:space="preserve">Usage</w:t>
-            </w:r>
-          </w:p>
-        </w:tc>
-      </w:tr>
-      <w:tr>
-        <w:tc>
-          <w:p>
-            <w:r>
-              <w:t xml:space="preserve">Gold Primary</w:t>
-            </w:r>
-          </w:p>
-        </w:tc>
-        <w:tc>
-          <w:p>
-            <w:r>
-              <w:t xml:space="preserve">#D4AF37</w:t>
-            </w:r>
-          </w:p>
-        </w:tc>
-        <w:tc>
-          <w:p>
-            <w:r>
-              <w:t xml:space="preserve">rgb(212, 175, 55)</w:t>
-            </w:r>
-          </w:p>
-        </w:tc>
-        <w:tc>
-          <w:p>
-            <w:r>
-              <w:t xml:space="preserve">Primary CTAs, title spans</w:t>
-            </w:r>
-          </w:p>
-        </w:tc>
-      </w:tr>
-      <w:tr>
-        <w:tc>
-          <w:p>
-            <w:r>
-              <w:t xml:space="preserve">Noir Dark Background</w:t>
-            </w:r>
-          </w:p>
-        </w:tc>
-        <w:tc>
-          <w:p>
-            <w:r>
-              <w:t xml:space="preserve">#0B0C0E</w:t>
-            </w:r>
-          </w:p>
-        </w:tc>
-        <w:tc>
-          <w:p>
-            <w:r>
-              <w:t xml:space="preserve">rgb(11, 12, 14)</w:t>
-            </w:r>
-          </w:p>
-        </w:tc>
-        <w:tc>
-          <w:p>
-            <w:r>
-              <w:t xml:space="preserve">Dark page body background</w:t>
-            </w:r>
-          </w:p>
-        </w:tc>
-      </w:tr>
-      <w:tr>
-        <w:tc>
-          <w:p>
-            <w:r>
-              <w:t xml:space="preserve">Card Surface</w:t>
-            </w:r>
-          </w:p>
-        </w:tc>
-        <w:tc>
-          <w:p>
-            <w:r>
-              <w:t xml:space="preserve">#14161A</w:t>
-            </w:r>
-          </w:p>
-        </w:tc>
-        <w:tc>
-          <w:p>
-            <w:r>
-              <w:t xml:space="preserve">rgb(20, 22, 26)</w:t>
-            </w:r>
-          </w:p>
-        </w:tc>
-        <w:tc>
-          <w:p>
-            <w:r>
-              <w:t xml:space="preserve">Card containers &amp; modals</w:t>
-            </w:r>
-          </w:p>
-        </w:tc>
-      </w:tr>
-      <w:tr>
-        <w:tc>
-          <w:p>
-            <w:r>
-              <w:t xml:space="preserve">Text Primary</w:t>
-            </w:r>
-          </w:p>
-        </w:tc>
-        <w:tc>
-          <w:p>
-            <w:r>
-              <w:t xml:space="preserve">#F3F4F6</w:t>
-            </w:r>
-          </w:p>
-        </w:tc>
-        <w:tc>
-          <w:p>
-            <w:r>
-              <w:t xml:space="preserve">rgb(243, 244, 246)</w:t>
-            </w:r>
-          </w:p>
-        </w:tc>
-        <w:tc>
-          <w:p>
-            <w:r>
-              <w:t xml:space="preserve">High contrast white body text</w:t>
-            </w:r>
-          </w:p>
-        </w:tc>
-      </w:tr>
-    </w:tbl>
+        </w:rPr>
+        <w:t xml:space="preserve">Heading Font: </w:t>
+      </w:r>
+      <w:r>
+        <w:t xml:space="preserve">Cormorant Garamond (Weights: 400, 500, 600, 700; Fallbacks: Georgia, serif)</w:t>
+      </w:r>
+    </w:p>
+    <w:p>
+      <w:pPr>
+        <w:spacing w:after="80"/>
+      </w:pPr>
+      <w:r>
+        <w:rPr>
+          <w:b/>
+          <w:bCs/>
+        </w:rPr>
+        <w:t xml:space="preserve">Pharaonic Accent Font: </w:t>
+      </w:r>
+      <w:r>
+        <w:t xml:space="preserve">Cinzel / Cinzel Decorative (Weights: 600, 700, 800)</w:t>
+      </w:r>
+    </w:p>
+    <w:p>
+      <w:pPr>
+        <w:spacing w:after="200"/>
+      </w:pPr>
+      <w:r>
+        <w:rPr>
+          <w:b/>
+          <w:bCs/>
+        </w:rPr>
+        <w:t xml:space="preserve">Body Copy Font: </w:t>
+      </w:r>
+      <w:r>
+        <w:t xml:space="preserve">Plus Jakarta Sans (Weights: 300, 400, 500, 600, 700; Fallbacks: system-ui, sans-serif)</w:t>
+      </w:r>
+    </w:p>
     <w:p>
       <w:pPr>
         <w:pStyle w:val="Heading1"/>
         <w:spacing w:after="120" w:before="300"/>
       </w:pPr>
       <w:r>
-        <w:t xml:space="preserve">3. Typography Hierarchy &amp; Font System</w:t>
-      </w:r>
-    </w:p>
-    <w:p>
-      <w:pPr>
-        <w:spacing w:after="80"/>
-      </w:pPr>
-      <w:r>
-        <w:rPr>
-          <w:b/>
-          <w:bCs/>
-        </w:rPr>
-        <w:t xml:space="preserve">Heading Font: </w:t>
-      </w:r>
-      <w:r>
-        <w:t xml:space="preserve">Cormorant Garamond (Weights: 400, 500, 600, 700; Fallbacks: Georgia, serif)</w:t>
-      </w:r>
-    </w:p>
-    <w:p>
-      <w:pPr>
-        <w:spacing w:after="80"/>
-      </w:pPr>
-      <w:r>
-        <w:rPr>
-          <w:b/>
-          <w:bCs/>
-        </w:rPr>
-        <w:t xml:space="preserve">Pharaonic Accent Font: </w:t>
-      </w:r>
-      <w:r>
-        <w:t xml:space="preserve">Cinzel / Cinzel Decorative (Weights: 600, 700, 800)</w:t>
-      </w:r>
-    </w:p>
-    <w:p>
-      <w:pPr>
-        <w:spacing w:after="200"/>
-      </w:pPr>
-      <w:r>
-        <w:rPr>
-          <w:b/>
-          <w:bCs/>
-        </w:rPr>
-        <w:t xml:space="preserve">Body Copy Font: </w:t>
-      </w:r>
-      <w:r>
-        <w:t xml:space="preserve">Plus Jakarta Sans (Weights: 300, 400, 500, 600, 700; Fallbacks: system-ui, sans-serif)</w:t>
-      </w:r>
-    </w:p>
-    <w:p>
-      <w:pPr>
-        <w:pStyle w:val="Heading1"/>
-        <w:spacing w:after="120" w:before="300"/>
-      </w:pPr>
-      <w:r>
         <w:t xml:space="preserve">4. Complete Design Assets Catalog (design_assets/)</w:t>
       </w:r>
     </w:p>
@@ -598,7 +375,7 @@
         <w:spacing w:after="120"/>
       </w:pPr>
       <w:r>
-        <w:t xml:space="preserve">All high-resolution image files copied into design_assets/ folder:</w:t>
+        <w:t xml:space="preserve">All high-resolution image files inside design_assets/ folder:</w:t>
       </w:r>
     </w:p>
     <w:tbl>
@@ -669,30 +446,7 @@
         <w:tc>
           <w:p>
             <w:r>
-              <w:t xml:space="preserve">tut_stones_logo_without_background.png</w:t>
-            </w:r>
-          </w:p>
-        </w:tc>
-        <w:tc>
-          <w:p>
-            <w:r>
-              <w:t xml:space="preserve">PNG (Transparent)</w:t>
-            </w:r>
-          </w:p>
-        </w:tc>
-        <w:tc>
-          <w:p>
-            <w:r>
-              <w:t xml:space="preserve">Isolated brand logo emblem with transparent background</w:t>
-            </w:r>
-          </w:p>
-        </w:tc>
-      </w:tr>
-      <w:tr>
-        <w:tc>
-          <w:p>
-            <w:r>
-              <w:t xml:space="preserve">tut_stones_logo_with_background.png</w:t>
+              <w:t xml:space="preserve">tut_stones_logo.png</w:t>
             </w:r>
           </w:p>
         </w:tc>
@@ -706,30 +460,7 @@
         <w:tc>
           <w:p>
             <w:r>
-              <w:t xml:space="preserve">Brand emblem set on dark Pharaonic stone texture</w:t>
-            </w:r>
-          </w:p>
-        </w:tc>
-      </w:tr>
-      <w:tr>
-        <w:tc>
-          <w:p>
-            <w:r>
-              <w:t xml:space="preserve">tut_stones_logo.png</w:t>
-            </w:r>
-          </w:p>
-        </w:tc>
-        <w:tc>
-          <w:p>
-            <w:r>
-              <w:t xml:space="preserve">PNG</w:t>
-            </w:r>
-          </w:p>
-        </w:tc>
-        <w:tc>
-          <w:p>
-            <w:r>
-              <w:t xml:space="preserve">Original header navbar brand mark</w:t>
+              <w:t xml:space="preserve">Official brand logo mark</w:t>
             </w:r>
           </w:p>
         </w:tc>

</xml_diff>